<commit_message>
finish(seo C3): Fable review fixes
CONFIRMED: the .docx property children were out of ECMA-376 order (w:sz before w:color, w:spacing before w:pBdr): Word reports unreadable content. Fixed order, renderer v2, rebuilt; check:assets now order-checks every rPr/pPr in document.xml + styles.xml (ooxmlOrderErrors).
PLAUSIBLE, fixed: LeafLink FAQ no longer implies QuickBooks is required; embed pages drop the conflicting canonical; policy builder clears its output on a validation error and skips credit fields in COD mode; MM/DD/YYYY accepts years 1900-2199 only; build-tutorials keeps pages for unlisted (not private) videos only; Scan E catches Shelfpay / Shelf Pay / Shelf&nbsp;Pay / Shelf<br>Pay / Shelf-Pay / SHELF PAY; stale llms.txt tutorials line; fixture comment no longer overclaims.

Co-Authored-By: Claude Opus 5.5 <noreply@anthropic.com>
</commit_message>
<xml_diff>
--- a/templates/files/dispensary-credit-application.docx
+++ b/templates/files/dispensary-credit-application.docx
@@ -570,8 +570,8 @@
       </w:pPr>
       <w:r>
         <w:rPr>
+          <w:color w:val="475569"/>
           <w:sz w:val="18"/>
-          <w:color w:val="475569"/>
         </w:rPr>
         <w:t xml:space="preserve">Signature</w:t>
       </w:r>
@@ -593,8 +593,8 @@
       </w:pPr>
       <w:r>
         <w:rPr>
+          <w:color w:val="475569"/>
           <w:sz w:val="18"/>
-          <w:color w:val="475569"/>
         </w:rPr>
         <w:t xml:space="preserve">Printed name and title</w:t>
       </w:r>
@@ -616,8 +616,8 @@
       </w:pPr>
       <w:r>
         <w:rPr>
+          <w:color w:val="475569"/>
           <w:sz w:val="18"/>
-          <w:color w:val="475569"/>
         </w:rPr>
         <w:t xml:space="preserve">Date (MM/DD/YYYY)</w:t>
       </w:r>
@@ -639,8 +639,8 @@
       </w:pPr>
       <w:r>
         <w:rPr>
+          <w:color w:val="475569"/>
           <w:sz w:val="18"/>
-          <w:color w:val="475569"/>
         </w:rPr>
         <w:t xml:space="preserve">Company</w:t>
       </w:r>
@@ -683,10 +683,10 @@
     </w:p>
     <w:p>
       <w:pPr>
-        <w:spacing w:before="360"/>
         <w:pBdr>
           <w:top w:val="single" w:sz="4" w:space="6" w:color="CBD5E1"/>
         </w:pBdr>
+        <w:spacing w:before="360"/>
       </w:pPr>
       <w:r>
         <w:rPr>
@@ -699,8 +699,8 @@
     <w:p>
       <w:r>
         <w:rPr>
+          <w:color w:val="64748B"/>
           <w:sz w:val="16"/>
-          <w:color w:val="64748B"/>
         </w:rPr>
         <w:t xml:space="preserve">Free template from ShelfSpace · shelfspace.pro/templates/dispensary-credit-application</w:t>
       </w:r>

</xml_diff>